<commit_message>
docs: approve post-Stage C masters without version increments
</commit_message>
<xml_diff>
--- a/docs/Sorting_Apocalypse_Preliminary_GDD_v0.14.docx
+++ b/docs/Sorting_Apocalypse_Preliminary_GDD_v0.14.docx
@@ -64,7 +64,7 @@
         <w:widowControl/>
       </w:pPr>
       <w:r>
-        <w:t>Version 0.14 | 14 October 2026 | Review edition</w:t>
+        <w:t>Version 0.14 | 14 October 2026 | Approved current master</w:t>
       </w:r>
     </w:p>
     <w:p>
@@ -91,7 +91,7 @@
         <w:widowControl/>
       </w:pPr>
       <w:r>
-        <w:t>Companion review editions: Prototype Findings v0.14; Visual Design &amp; World-Building Direction v0.11. These documents await documentation review; accepted gameplay and lighting milestones remain promoted.</w:t>
+        <w:t>Companion approved masters: Prototype Findings v0.14; Visual Design &amp; World-Building Direction v0.11. Document promotion approved on 14 October 2026 without version increments; accepted gameplay and lighting milestones remain promoted.</w:t>
       </w:r>
     </w:p>
     <w:p>
@@ -146,7 +146,7 @@
         <w:widowControl/>
       </w:pPr>
       <w:r>
-        <w:t>This 14 October review edition reconciles Receiving through published Stage C closure at bb6683d28539ff743bc480a9d5d68c4ef3d0ce87. Established gameplay and balance rules remain. Implemented prototype behavior is distinguished from future Systems MVP integration; this revision selects no next milestone. [R14]</w:t>
+        <w:t>This approved 14 October edition reconciles Receiving through published Stage C closure at bb6683d28539ff743bc480a9d5d68c4ef3d0ce87. Established gameplay and balance rules remain. Implemented prototype behavior is distinguished from future Systems MVP integration; this revision selects no next milestone. [R14]</w:t>
       </w:r>
     </w:p>
     <w:p>
@@ -23153,7 +23153,7 @@
     <w:p>
       <w:pPr/>
       <w:r>
-        <w:t>The continuing wing, accepted compact geometry, normal entry, authored palette and promoted storage foundation remain baseline. GDD v0.14, Findings v0.14 and VDD v0.11 are local review editions awaiting document review. Preserve prior editions, dated evidence and ignored licensed assets/import state.</w:t>
+        <w:t>The continuing wing, accepted compact geometry, normal entry, authored palette and promoted storage foundation remain baseline. GDD v0.14, Findings v0.14 and VDD v0.11 are the approved current masters. Preserve prior editions, dated evidence and ignored licensed assets/import state.</w:t>
       </w:r>
     </w:p>
     <w:tbl>
@@ -25601,7 +25601,7 @@
         <w:widowControl/>
       </w:pPr>
       <w:r>
-        <w:t>GDD v0.14, Findings v0.14 and VDD v0.11 are local review editions. Receiving C1 and Stage C are CLOSED / HUMAN-PROMOTED in their agreed scopes; ordinary room authoring does not automatically reopen them. This document review selects no next gameplay milestone. [R14]</w:t>
+        <w:t>GDD v0.14, Findings v0.14 and VDD v0.11 are the approved current masters. Receiving C1 and Stage C are CLOSED / HUMAN-PROMOTED in their agreed scopes; ordinary room authoring does not automatically reopen them. Document publication selects no next gameplay milestone. [R14]</w:t>
       </w:r>
     </w:p>
     <w:p>
@@ -26846,7 +26846,7 @@
                 <w:color w:val="25323A"/>
                 <w:sz w:val="18"/>
               </w:rPr>
-              <w:t>The final clamped expedition arrives and Receiving reaches three deposited batches: one active plus two queued.</w:t>
+              <w:t>Receiving is already full: one active plus two deposited queued batches. The final clamped expedition returns and becomes Awaiting Lift.</w:t>
             </w:r>
           </w:p>
         </w:tc>
@@ -26868,7 +26868,7 @@
                 <w:color w:val="25323A"/>
                 <w:sz w:val="18"/>
               </w:rPr>
-              <w:t>Unload enough to prevent an Awaiting Lift team from abandoning its loot at midnight.</w:t>
+              <w:t>Fully empty the active batch, then allow shutter closure, latching and complete outbound departure to release a deposited slot before midnight. Partial unloading releases no slot; enough time is not guaranteed. Illustrative pressure, not a new timing or balance rule.</w:t>
             </w:r>
           </w:p>
         </w:tc>
@@ -33447,7 +33447,7 @@
         <w:widowControl/>
       </w:pPr>
       <w:r>
-        <w:t>14 October 2026. Local review edition awaiting documentation review. Reconciles active summaries, §§5, 9, 11, 16, 18, 20–21 and Appendix B with published Stage C closure; preserves balances, future night/Expedition design and dated history. No implementation, next-milestone selection, push or merge accompanies this update.</w:t>
+        <w:t>14 October 2026. Approved current master; same-edition document promotion authorized. Reconciles active summaries, §§5, 9, 11, 16, 18, 20–21 and Appendix B with published Stage C closure; preserves balances, future night/Expedition design and dated history. No gameplay implementation or next-milestone selection accompanies document publication.</w:t>
       </w:r>
     </w:p>
     <w:p>

</xml_diff>